<commit_message>
312: act on the adversarial review of PR 40
Terms page sections 3 to 6 now match the MSA and point at /agreements
instead of stating a licence-only ownership model. MSA: deposit and
convenience termination ranked against each other, acceptance carve-out
for deployment that is delivery, mutual indemnity as new section 12,
entire-agreement exception for a project WFH or NDA, AI caveat shared
with the WFH. WFH: indemnity mirror for standalone use. Contractor:
Colorado notice in bold, customer non-solicit and no-poach replaced with
a trade-secret non-circumvention, payment for work performed rather than
accepted. Change Order gains a Background IP table.

Generator: stage the DOCX inside Word's container before opening so no
file-access dialog can appear, check the active document's name before
every close, write version.json for the page. Accessibility statement
discloses the untagged PDFs. README documents the build and OneDrive copy.
</commit_message>
<xml_diff>
--- a/public/agreements/Contractor_Agreement_LuwahTech_Template_v1.docx
+++ b/public/agreements/Contractor_Agreement_LuwahTech_Template_v1.docx
@@ -394,7 +394,7 @@
           <w:color w:val="666666"/>
           <w:sz w:val="19"/>
         </w:rPr>
-        <w:t>Template v1.0, 2026-09-17. Replace every bracketed field, fill or delete every schedule, and delete this note before sending. The signed document governs, not this template.</w:t>
+        <w:t>Template v1.0, 2026-09-18. Replace every bracketed field, fill or delete every schedule, and delete this note before sending. The signed document governs, not this template.</w:t>
       </w:r>
     </w:p>
     <w:p>
@@ -1085,7 +1085,7 @@
       <w:r>
         <w:rPr>
           <w:rFonts w:ascii="Open Sans" w:hAnsi="Open Sans" w:cs="Open Sans" w:eastAsia="Open Sans"/>
-          <w:b w:val="0"/>
+          <w:b/>
           <w:i w:val="0"/>
           <w:color w:val="262626"/>
           <w:sz w:val="21"/>
@@ -1850,7 +1850,7 @@
           <w:color w:val="262626"/>
           <w:sz w:val="21"/>
         </w:rPr>
-        <w:t>Contractor will not use Confidential Information, including a Client's identity, needs, systems, pricing or contacts learned through the Services, to solicit, serve or divert any Client other than through Company. If a Client asks Contractor to work directly for it, Contractor will refer the Client to Company.</w:t>
+        <w:t>Contractor will not use Company's trade secrets or Confidential Information, including a Client's identity, needs, systems, pricing or contacts learned through the Services, to solicit or divert any Client. This clause protects Company's trade secrets and Confidential Information. It is not a covenant not to compete and does not stop Contractor from working for anyone using information Contractor did not obtain through the Services.</w:t>
       </w:r>
     </w:p>
     <w:p>
@@ -1879,7 +1879,7 @@
           <w:color w:val="262626"/>
           <w:sz w:val="21"/>
         </w:rPr>
-        <w:t>During the term and for 12 months after it, Contractor will not solicit for employment or engagement any employee or contractor of Company that Contractor worked with under this Agreement.</w:t>
+        <w:t>If a Client asks Contractor to work directly for it during a Work Order, Contractor will tell Company within 2 business days.</w:t>
       </w:r>
     </w:p>
     <w:p>
@@ -2098,7 +2098,7 @@
           <w:color w:val="262626"/>
           <w:sz w:val="21"/>
         </w:rPr>
-        <w:t>When this Agreement or a Work Order ends, Contractor delivers all Work Product completed or in progress, returns or deletes Confidential Information under Section 6.3, and deletes credentials under Section 7.6. Company pays for Services performed and accepted up to the end date.</w:t>
+        <w:t>When this Agreement or a Work Order ends, Contractor delivers all Work Product completed or in progress, returns or deletes Confidential Information under Section 6.3, and deletes credentials under Section 7.6. Company pays for Services performed up to the end date, subject to Sections 3.3 and 11.</w:t>
       </w:r>
     </w:p>
     <w:p>

</xml_diff>

<commit_message>
312: act on the NDA port review, shared clauses across the documents
Findings 2, 4, 5 and S1 from the adversarial review of the #311 NDA port
land here because they are about the MSA and the contractor agreement.
MSA 15.2 now preserves any mutual NDA, project WFH or other NDA the
Parties signed, not only one signed for a specific project. The
contractor agreement gains the 18 U.S.C. 1833(b) whistleblower notice,
without which a DTSA claim loses exemplary damages and fees, and a
general-knowledge carve-out that keeps its confidentiality section
outside C.R.S. 8-2-113. Notices, Severability and Headings are hoisted
to constants used by all three documents, and Notices gains the
change-of-address sentence.
</commit_message>
<xml_diff>
--- a/public/agreements/Contractor_Agreement_LuwahTech_Template_v1.docx
+++ b/public/agreements/Contractor_Agreement_LuwahTech_Template_v1.docx
@@ -1578,6 +1578,84 @@
     </w:p>
     <w:p>
       <w:pPr>
+        <w:tabs>
+          <w:tab w:pos="648" w:val="left"/>
+        </w:tabs>
+        <w:ind w:left="648" w:hanging="648"/>
+      </w:pPr>
+      <w:r>
+        <w:rPr>
+          <w:rFonts w:ascii="Open Sans" w:hAnsi="Open Sans" w:cs="Open Sans" w:eastAsia="Open Sans"/>
+          <w:b/>
+          <w:i w:val="0"/>
+          <w:color w:val="4A90A4"/>
+          <w:sz w:val="21"/>
+        </w:rPr>
+        <w:t>6.5</w:t>
+        <w:tab/>
+      </w:r>
+      <w:r>
+        <w:rPr>
+          <w:rFonts w:ascii="Open Sans" w:hAnsi="Open Sans" w:cs="Open Sans" w:eastAsia="Open Sans"/>
+          <w:b/>
+          <w:i w:val="0"/>
+          <w:color w:val="262626"/>
+          <w:sz w:val="21"/>
+        </w:rPr>
+        <w:t xml:space="preserve">General knowledge. </w:t>
+      </w:r>
+      <w:r>
+        <w:rPr>
+          <w:rFonts w:ascii="Open Sans" w:hAnsi="Open Sans" w:cs="Open Sans" w:eastAsia="Open Sans"/>
+          <w:b w:val="0"/>
+          <w:i w:val="0"/>
+          <w:color w:val="262626"/>
+          <w:sz w:val="21"/>
+        </w:rPr>
+        <w:t>Nothing in this Agreement prohibits Contractor from using the general training, knowledge, skills and experience Contractor gains through the Services, including methods and techniques of general application, provided Contractor does not use or disclose Confidential Information in doing so. This clause grants no license under any intellectual property right.</w:t>
+      </w:r>
+    </w:p>
+    <w:p>
+      <w:pPr>
+        <w:tabs>
+          <w:tab w:pos="648" w:val="left"/>
+        </w:tabs>
+        <w:ind w:left="648" w:hanging="648"/>
+      </w:pPr>
+      <w:r>
+        <w:rPr>
+          <w:rFonts w:ascii="Open Sans" w:hAnsi="Open Sans" w:cs="Open Sans" w:eastAsia="Open Sans"/>
+          <w:b/>
+          <w:i w:val="0"/>
+          <w:color w:val="4A90A4"/>
+          <w:sz w:val="21"/>
+        </w:rPr>
+        <w:t>6.6</w:t>
+        <w:tab/>
+      </w:r>
+      <w:r>
+        <w:rPr>
+          <w:rFonts w:ascii="Open Sans" w:hAnsi="Open Sans" w:cs="Open Sans" w:eastAsia="Open Sans"/>
+          <w:b/>
+          <w:i w:val="0"/>
+          <w:color w:val="262626"/>
+          <w:sz w:val="21"/>
+        </w:rPr>
+        <w:t xml:space="preserve">Whistleblower immunity. </w:t>
+      </w:r>
+      <w:r>
+        <w:rPr>
+          <w:rFonts w:ascii="Open Sans" w:hAnsi="Open Sans" w:cs="Open Sans" w:eastAsia="Open Sans"/>
+          <w:b w:val="0"/>
+          <w:i w:val="0"/>
+          <w:color w:val="262626"/>
+          <w:sz w:val="21"/>
+        </w:rPr>
+        <w:t>Under the Defend Trade Secrets Act, 18 U.S.C. § 1833(b), an individual is not liable under any federal or state trade secret law for disclosing a trade secret in confidence to a federal, state or local government official, or to an attorney, solely to report or investigate a suspected violation of law, or in a complaint or other document filed under seal in a lawsuit. Nothing in this Agreement limits that immunity or prevents any person from reporting a possible violation of law to a government agency.</w:t>
+      </w:r>
+    </w:p>
+    <w:p>
+      <w:pPr>
         <w:pStyle w:val="Heading1"/>
       </w:pPr>
       <w:r>
@@ -2382,7 +2460,7 @@
           <w:color w:val="262626"/>
           <w:sz w:val="21"/>
         </w:rPr>
-        <w:t>Notices must be in writing and sent by email to the address in the signature block. A notice of breach or termination must also be sent by courier or certified mail to the notice address in the signature block. Email notice is effective on the next business day after sending, unless the sender receives a delivery failure.</w:t>
+        <w:t>Notices must be in writing and sent by email to the address in the signature block. A notice of breach or termination must also be sent by courier or certified mail to the notice address in the signature block. Email notice is effective on the next business day after sending, unless the sender receives a delivery failure. A Party may change its notice address by notice under this Section.</w:t>
       </w:r>
     </w:p>
     <w:p>
@@ -2538,7 +2616,7 @@
           <w:color w:val="262626"/>
           <w:sz w:val="21"/>
         </w:rPr>
-        <w:t>If a court finds a term unenforceable, the court will limit it to the minimum extent needed and the rest stays in effect. This Agreement and any Work Order may be signed in counterparts and electronically. An electronic or scanned signature has the same effect as an original.</w:t>
+        <w:t>If a court finds a term unenforceable, the court will limit it to the minimum extent needed and the rest of this Agreement stays in effect. This Agreement and any document signed under it may be signed in counterparts and electronically. An electronic or scanned signature has the same effect as an original.</w:t>
       </w:r>
     </w:p>
     <w:p>
@@ -2577,7 +2655,7 @@
           <w:color w:val="262626"/>
           <w:sz w:val="21"/>
         </w:rPr>
-        <w:t>Headings are for convenience only. Each Party has had the opportunity to obtain independent legal advice before signing.</w:t>
+        <w:t>Headings are for convenience only and do not affect interpretation. Each Party has had the opportunity to obtain independent legal advice before signing.</w:t>
       </w:r>
     </w:p>
     <w:p>

</xml_diff>

<commit_message>
Agreements: accessibility toolkit as Luwah IP, AI tools disclosed by name
The Luwah accessibility toolkit is Background IP licensed to the delivered
website only, with no copying to other properties, no resale, and a duty to
keep the published statement accurate. Clause in the MSA and the work-for-hire
agreement, a row in each Background IP schedule, and a company-tools clause in
the contractor agreement.

AI use is disclosed by name, Anthropic Claude and Google Gemini, for both
building and operating client systems, with human review, no tools that train
on client data, and no PHI or card data to any AI tool without a written
agreement. The NDA gains an AI clause for confidential information. The site
privacy policy gains an Artificial Intelligence section and the /agreements
page reflects both.
</commit_message>
<xml_diff>
--- a/public/agreements/Contractor_Agreement_LuwahTech_Template_v1.docx
+++ b/public/agreements/Contractor_Agreement_LuwahTech_Template_v1.docx
@@ -1673,7 +1673,46 @@
           <w:color w:val="262626"/>
           <w:sz w:val="21"/>
         </w:rPr>
-        <w:t>Contractor may use AI-assisted tools only where the Work Order permits them. Contractor will never submit Company or Client Confidential Information to an AI tool that trains on submitted data. Contractor reviews all AI-assisted output and remains responsible for the Work Product.</w:t>
+        <w:t>Contractor may use AI-assisted tools only where the Work Order permits them, and only tools operated under terms that do not permit the vendor to train on submitted content. Contractor never submits Company or Client Confidential Information to a consumer tier of any AI service, never submits credentials to any AI tool, and submits protected health information, payment card data or other regulated data to an AI tool only where the Work Order expressly provides for it and states the written agreement that covers it. Contractor tells the participants before an AI tool records or transcribes a meeting. Contractor reviews all AI-assisted output and remains responsible for the Work Product.</w:t>
+      </w:r>
+    </w:p>
+    <w:p>
+      <w:pPr>
+        <w:tabs>
+          <w:tab w:pos="648" w:val="left"/>
+        </w:tabs>
+        <w:ind w:left="648" w:hanging="648"/>
+      </w:pPr>
+      <w:r>
+        <w:rPr>
+          <w:rFonts w:ascii="Open Sans" w:hAnsi="Open Sans" w:cs="Open Sans" w:eastAsia="Open Sans"/>
+          <w:b/>
+          <w:i w:val="0"/>
+          <w:color w:val="4A90A4"/>
+          <w:sz w:val="21"/>
+        </w:rPr>
+        <w:t>5.10</w:t>
+        <w:tab/>
+      </w:r>
+      <w:r>
+        <w:rPr>
+          <w:rFonts w:ascii="Open Sans" w:hAnsi="Open Sans" w:cs="Open Sans" w:eastAsia="Open Sans"/>
+          <w:b/>
+          <w:i w:val="0"/>
+          <w:color w:val="262626"/>
+          <w:sz w:val="21"/>
+        </w:rPr>
+        <w:t xml:space="preserve">Company tools. </w:t>
+      </w:r>
+      <w:r>
+        <w:rPr>
+          <w:rFonts w:ascii="Open Sans" w:hAnsi="Open Sans" w:cs="Open Sans" w:eastAsia="Open Sans"/>
+          <w:b w:val="0"/>
+          <w:i w:val="0"/>
+          <w:color w:val="262626"/>
+          <w:sz w:val="21"/>
+        </w:rPr>
+        <w:t>Company's own tools and libraries, including the Luwah Accessibility Toolkit, the n8n workflow library, the web starter and the operations scripts, are Company property. Their source code, build configuration, design and documentation are Confidential Information even where a compiled or served copy is public. Contractor uses them only for the Work Order that requires them, does not copy them to any other system or client, keeps no copy after the Work Order ends, and does not build a similar product from their source, design or documentation during the term or for 12 months after it. This clause protects Company's trade secrets and Confidential Information. It is not a covenant not to compete and does not restrict Contractor from using general skills, knowledge and experience or publicly available information.</w:t>
       </w:r>
     </w:p>
     <w:p>

</xml_diff>

<commit_message>
312: house cover page and section bands, Word export safeguards
The templates now open on the dark cover used by the signed Letters of
Agreement: tag line, thin wordmark, document title, client line, Between
and Document blocks, tagline. Section headings render as copper bands.
Each Doc carries doc_prefix, cover_line and cover_parties for the cover.

Export: refuse to run while Word has any document open, and quit Word
when nothing is open once the run ends. Word re-serves a same-named
document it already has open, which exported a stale PDF when two
sessions drove it at once.

Site: /agreements bullets on AI tools (Anthropic Claude, Google Gemini)
and the Luwah Accessibility Toolkit staying ours. Terms section 1 states
the AI tools and the bright line on credentials and regulated data. The
matching clause text lands in a stacked branch from the #311 session.
</commit_message>
<xml_diff>
--- a/public/agreements/Contractor_Agreement_LuwahTech_Template_v1.docx
+++ b/public/agreements/Contractor_Agreement_LuwahTech_Template_v1.docx
@@ -2,8 +2,232 @@
 <file path=word/document.xml><?xml version="1.0" encoding="utf-8"?>
 <w:document xmlns:wpc="http://schemas.microsoft.com/office/word/2010/wordprocessingCanvas" xmlns:mo="http://schemas.microsoft.com/office/mac/office/2008/main" xmlns:mc="http://schemas.openxmlformats.org/markup-compatibility/2006" xmlns:mv="urn:schemas-microsoft-com:mac:vml" xmlns:o="urn:schemas-microsoft-com:office:office" xmlns:r="http://schemas.openxmlformats.org/officeDocument/2006/relationships" xmlns:m="http://schemas.openxmlformats.org/officeDocument/2006/math" xmlns:v="urn:schemas-microsoft-com:vml" xmlns:wp14="http://schemas.microsoft.com/office/word/2010/wordprocessingDrawing" xmlns:wp="http://schemas.openxmlformats.org/drawingml/2006/wordprocessingDrawing" xmlns:w10="urn:schemas-microsoft-com:office:word" xmlns:w="http://schemas.openxmlformats.org/wordprocessingml/2006/main" xmlns:w14="http://schemas.microsoft.com/office/word/2010/wordml" xmlns:wpg="http://schemas.microsoft.com/office/word/2010/wordprocessingGroup" xmlns:wpi="http://schemas.microsoft.com/office/word/2010/wordprocessingInk" xmlns:wne="http://schemas.microsoft.com/office/word/2006/wordml" xmlns:wps="http://schemas.microsoft.com/office/word/2010/wordprocessingShape" mc:Ignorable="w14 wp14">
   <w:body>
+    <w:tbl>
+      <w:tblPr>
+        <w:tblW w:type="auto" w:w="0"/>
+        <w:jc w:val="center"/>
+        <w:tblLook w:firstColumn="1" w:firstRow="1" w:lastColumn="0" w:lastRow="0" w:noHBand="0" w:noVBand="1" w:val="04A0"/>
+      </w:tblPr>
+      <w:tblGrid>
+        <w:gridCol w:w="9360"/>
+      </w:tblGrid>
+      <w:tr>
+        <w:trPr>
+          <w:trHeight w:val="12527" w:hRule="exact"/>
+        </w:trPr>
+        <w:tc>
+          <w:tcPr>
+            <w:tcW w:type="dxa" w:w="9360"/>
+            <w:shd w:val="clear" w:color="auto" w:fill="1C1C1E"/>
+            <w:tcMar>
+              <w:top w:w="900" w:type="dxa"/>
+              <w:start w:w="720" w:type="dxa"/>
+              <w:bottom w:w="720" w:type="dxa"/>
+              <w:end w:w="720" w:type="dxa"/>
+            </w:tcMar>
+          </w:tcPr>
+          <w:p>
+            <w:pPr>
+              <w:spacing w:after="0"/>
+            </w:pPr>
+          </w:p>
+          <w:p>
+            <w:pPr>
+              <w:spacing w:before="0" w:after="120"/>
+              <w:jc w:val="left"/>
+              <w:pBdr>
+                <w:bottom w:val="single" w:sz="18" w:space="4" w:color="B87333"/>
+              </w:pBdr>
+            </w:pPr>
+            <w:r>
+              <w:rPr>
+                <w:rFonts w:ascii="Tw Cen MT" w:hAnsi="Tw Cen MT" w:cs="Tw Cen MT" w:eastAsia="Tw Cen MT"/>
+                <w:b w:val="0"/>
+                <w:color w:val="4A90A4"/>
+                <w:sz w:val="18"/>
+                <w:spacing w:val="60"/>
+              </w:rPr>
+              <w:t>CLIENT AGREEMENT   ·   INDEPENDENT CONTRACTOR AGREEMENT</w:t>
+            </w:r>
+          </w:p>
+          <w:p>
+            <w:pPr>
+              <w:spacing w:before="720" w:after="0"/>
+              <w:jc w:val="left"/>
+            </w:pPr>
+            <w:r>
+              <w:rPr>
+                <w:rFonts w:ascii="Tw Cen MT" w:hAnsi="Tw Cen MT" w:cs="Tw Cen MT" w:eastAsia="Tw Cen MT"/>
+                <w:b w:val="0"/>
+                <w:color w:val="FFFFFF"/>
+                <w:sz w:val="60"/>
+                <w:spacing w:val="40"/>
+              </w:rPr>
+              <w:t>LUWAH</w:t>
+            </w:r>
+          </w:p>
+          <w:p>
+            <w:pPr>
+              <w:spacing w:before="0" w:after="0"/>
+              <w:jc w:val="left"/>
+            </w:pPr>
+            <w:r>
+              <w:rPr>
+                <w:rFonts w:ascii="Tw Cen MT" w:hAnsi="Tw Cen MT" w:cs="Tw Cen MT" w:eastAsia="Tw Cen MT"/>
+                <w:b w:val="0"/>
+                <w:color w:val="B87333"/>
+                <w:sz w:val="60"/>
+                <w:spacing w:val="40"/>
+              </w:rPr>
+              <w:t>TECHNOLOGIES</w:t>
+            </w:r>
+          </w:p>
+          <w:p>
+            <w:pPr>
+              <w:spacing w:before="1920" w:after="0"/>
+              <w:jc w:val="left"/>
+            </w:pPr>
+            <w:r>
+              <w:rPr>
+                <w:rFonts w:ascii="Tw Cen MT" w:hAnsi="Tw Cen MT" w:cs="Tw Cen MT" w:eastAsia="Tw Cen MT"/>
+                <w:b w:val="0"/>
+                <w:color w:val="FFFFFF"/>
+                <w:sz w:val="48"/>
+              </w:rPr>
+              <w:t>Independent Contractor Agreement</w:t>
+            </w:r>
+          </w:p>
+          <w:p>
+            <w:pPr>
+              <w:spacing w:before="0" w:after="80"/>
+              <w:jc w:val="left"/>
+              <w:pBdr>
+                <w:bottom w:val="single" w:sz="4" w:space="4" w:color="555555"/>
+              </w:pBdr>
+            </w:pPr>
+            <w:r>
+              <w:rPr>
+                <w:rFonts w:ascii="Tw Cen MT" w:hAnsi="Tw Cen MT" w:cs="Tw Cen MT" w:eastAsia="Tw Cen MT"/>
+                <w:b w:val="0"/>
+                <w:color w:val="B87333"/>
+                <w:sz w:val="26"/>
+              </w:rPr>
+              <w:t>Terms for subcontractors performing work for Luwah Technologies and its clients</w:t>
+            </w:r>
+          </w:p>
+          <w:p>
+            <w:pPr>
+              <w:spacing w:before="120" w:after="0"/>
+              <w:jc w:val="left"/>
+            </w:pPr>
+            <w:r>
+              <w:rPr>
+                <w:rFonts w:ascii="Open Sans" w:hAnsi="Open Sans" w:cs="Open Sans" w:eastAsia="Open Sans"/>
+                <w:b w:val="0"/>
+                <w:color w:val="CCCCCC"/>
+                <w:sz w:val="21"/>
+              </w:rPr>
+              <w:t>[Contractor name]   |   [Client and project, or Internal]</w:t>
+            </w:r>
+          </w:p>
+          <w:p>
+            <w:pPr>
+              <w:spacing w:before="2200" w:after="40"/>
+              <w:jc w:val="left"/>
+            </w:pPr>
+            <w:r>
+              <w:rPr>
+                <w:rFonts w:ascii="Tw Cen MT" w:hAnsi="Tw Cen MT" w:cs="Tw Cen MT" w:eastAsia="Tw Cen MT"/>
+                <w:b w:val="0"/>
+                <w:color w:val="4A90A4"/>
+                <w:sz w:val="17"/>
+                <w:spacing w:val="40"/>
+              </w:rPr>
+              <w:t>BETWEEN</w:t>
+            </w:r>
+          </w:p>
+          <w:p>
+            <w:pPr>
+              <w:spacing w:before="0" w:after="0"/>
+              <w:jc w:val="left"/>
+            </w:pPr>
+            <w:r>
+              <w:rPr>
+                <w:rFonts w:ascii="Open Sans" w:hAnsi="Open Sans" w:cs="Open Sans" w:eastAsia="Open Sans"/>
+                <w:b w:val="0"/>
+                <w:color w:val="CCCCCC"/>
+                <w:sz w:val="20"/>
+              </w:rPr>
+              <w:t>Luwah Technologies LLC ("Company")</w:t>
+            </w:r>
+          </w:p>
+          <w:p>
+            <w:pPr>
+              <w:spacing w:before="0" w:after="0"/>
+              <w:jc w:val="left"/>
+            </w:pPr>
+            <w:r>
+              <w:rPr>
+                <w:rFonts w:ascii="Open Sans" w:hAnsi="Open Sans" w:cs="Open Sans" w:eastAsia="Open Sans"/>
+                <w:b w:val="0"/>
+                <w:color w:val="CCCCCC"/>
+                <w:sz w:val="20"/>
+              </w:rPr>
+              <w:t>[Contractor legal name] ("Contractor")</w:t>
+            </w:r>
+          </w:p>
+          <w:p>
+            <w:pPr>
+              <w:spacing w:before="240" w:after="40"/>
+              <w:jc w:val="left"/>
+            </w:pPr>
+            <w:r>
+              <w:rPr>
+                <w:rFonts w:ascii="Tw Cen MT" w:hAnsi="Tw Cen MT" w:cs="Tw Cen MT" w:eastAsia="Tw Cen MT"/>
+                <w:b w:val="0"/>
+                <w:color w:val="4A90A4"/>
+                <w:sz w:val="17"/>
+                <w:spacing w:val="40"/>
+              </w:rPr>
+              <w:t>DOCUMENT</w:t>
+            </w:r>
+          </w:p>
+          <w:p>
+            <w:pPr>
+              <w:spacing w:before="0" w:after="0"/>
+              <w:jc w:val="left"/>
+            </w:pPr>
+            <w:r>
+              <w:rPr>
+                <w:rFonts w:ascii="Open Sans" w:hAnsi="Open Sans" w:cs="Open Sans" w:eastAsia="Open Sans"/>
+                <w:b w:val="0"/>
+                <w:color w:val="CCCCCC"/>
+                <w:sz w:val="20"/>
+              </w:rPr>
+              <w:t>[ICA-YYYY-NN]   |   [Month DD, YYYY]   |   Template v1.0</w:t>
+            </w:r>
+          </w:p>
+          <w:p>
+            <w:pPr>
+              <w:spacing w:before="800" w:after="0"/>
+              <w:jc w:val="center"/>
+            </w:pPr>
+            <w:r>
+              <w:rPr>
+                <w:rFonts w:ascii="Open Sans" w:hAnsi="Open Sans" w:cs="Open Sans" w:eastAsia="Open Sans"/>
+                <w:b w:val="0"/>
+                <w:color w:val="B87333"/>
+                <w:sz w:val="20"/>
+              </w:rPr>
+              <w:t>Where Simplicity Meets Innovation</w:t>
+            </w:r>
+          </w:p>
+        </w:tc>
+      </w:tr>
+    </w:tbl>
     <w:p>
       <w:pPr>
+        <w:pageBreakBefore/>
         <w:spacing w:before="120" w:after="40"/>
       </w:pPr>
       <w:r>
@@ -5139,6 +5363,7 @@
       <w:pgSz w:w="12240" w:h="15840"/>
       <w:pgMar w:top="1584" w:right="1440" w:bottom="1296" w:left="1440" w:header="576" w:footer="576" w:gutter="0"/>
       <w:cols w:space="720"/>
+      <w:titlePg/>
       <w:docGrid w:linePitch="360"/>
     </w:sectPr>
   </w:body>
@@ -5711,15 +5936,21 @@
     <w:pPr>
       <w:keepNext/>
       <w:keepLines/>
-      <w:spacing w:before="280" w:after="80"/>
+      <w:spacing w:before="280" w:after="120"/>
+      <w:ind w:left="173"/>
       <w:outlineLvl w:val="0"/>
+      <w:shd w:val="clear" w:color="auto" w:fill="B87333"/>
+      <w:pBdr>
+        <w:top w:val="single" w:sz="12" w:space="3" w:color="B87333"/>
+        <w:bottom w:val="single" w:sz="12" w:space="3" w:color="B87333"/>
+      </w:pBdr>
     </w:pPr>
     <w:rPr>
       <w:rFonts w:ascii="Tw Cen MT" w:hAnsi="Tw Cen MT" w:cs="Tw Cen MT" w:eastAsia="Tw Cen MT"/>
-      <w:b/>
+      <w:b w:val="0"/>
       <w:bCs/>
-      <w:color w:val="4A90A4"/>
-      <w:sz w:val="26"/>
+      <w:color w:val="FFFFFF"/>
+      <w:sz w:val="25"/>
       <w:szCs w:val="28"/>
     </w:rPr>
   </w:style>

</xml_diff>

<commit_message>
312: act on the accessibility review of the agreements page
Download links keep their visible text at the start of the accessible
name, so voice control matches what is on the button (WCAG 2.5.3). The
Word files now carry real structure: exhibit sub-headings are Heading 2
under the Heading 1 exhibit title, every table's first row is a marked
header row, the header logo has alt text, and the document language is
set. The accessibility statement describes the PDFs and the Word files
as they are.
</commit_message>
<xml_diff>
--- a/public/agreements/Contractor_Agreement_LuwahTech_Template_v1.docx
+++ b/public/agreements/Contractor_Agreement_LuwahTech_Template_v1.docx
@@ -2926,6 +2926,7 @@
       </w:tblGrid>
       <w:tr>
         <w:trPr>
+          <w:tblHeader/>
           <w:cantSplit/>
         </w:trPr>
         <w:tc>
@@ -3784,7 +3785,7 @@
     </w:p>
     <w:p>
       <w:pPr>
-        <w:pStyle w:val="Heading3"/>
+        <w:pStyle w:val="Heading2"/>
       </w:pPr>
       <w:r>
         <w:t>1. Services</w:t>
@@ -3804,7 +3805,7 @@
     </w:p>
     <w:p>
       <w:pPr>
-        <w:pStyle w:val="Heading3"/>
+        <w:pStyle w:val="Heading2"/>
       </w:pPr>
       <w:r>
         <w:t>2. Deliverables and Acceptance Criteria</w:t>
@@ -3825,6 +3826,9 @@
         <w:gridCol w:w="2340"/>
       </w:tblGrid>
       <w:tr>
+        <w:trPr>
+          <w:tblHeader/>
+        </w:trPr>
         <w:tc>
           <w:tcPr>
             <w:tcW w:type="dxa" w:w="720"/>
@@ -4060,7 +4064,7 @@
     </w:p>
     <w:p>
       <w:pPr>
-        <w:pStyle w:val="Heading3"/>
+        <w:pStyle w:val="Heading2"/>
       </w:pPr>
       <w:r>
         <w:t>3. Compensation</w:t>
@@ -4081,6 +4085,9 @@
         <w:gridCol w:w="2340"/>
       </w:tblGrid>
       <w:tr>
+        <w:trPr>
+          <w:tblHeader/>
+        </w:trPr>
         <w:tc>
           <w:tcPr>
             <w:tcW w:type="dxa" w:w="2736"/>
@@ -4350,7 +4357,7 @@
     </w:p>
     <w:p>
       <w:pPr>
-        <w:pStyle w:val="Heading3"/>
+        <w:pStyle w:val="Heading2"/>
       </w:pPr>
       <w:r>
         <w:t>4. Access to Be Granted</w:t>
@@ -4371,6 +4378,9 @@
         <w:gridCol w:w="2340"/>
       </w:tblGrid>
       <w:tr>
+        <w:trPr>
+          <w:tblHeader/>
+        </w:trPr>
         <w:tc>
           <w:tcPr>
             <w:tcW w:type="dxa" w:w="2880"/>
@@ -4580,7 +4590,7 @@
     </w:p>
     <w:p>
       <w:pPr>
-        <w:pStyle w:val="Heading3"/>
+        <w:pStyle w:val="Heading2"/>
       </w:pPr>
       <w:r>
         <w:t>5. Client Terms and Security Requirements</w:t>
@@ -4716,6 +4726,7 @@
       </w:tblGrid>
       <w:tr>
         <w:trPr>
+          <w:tblHeader/>
           <w:cantSplit/>
         </w:trPr>
         <w:tc>
@@ -5140,6 +5151,9 @@
         <w:gridCol w:w="2340"/>
       </w:tblGrid>
       <w:tr>
+        <w:trPr>
+          <w:tblHeader/>
+        </w:trPr>
         <w:tc>
           <w:tcPr>
             <w:tcW w:type="dxa" w:w="2304"/>
@@ -5458,7 +5472,7 @@
       <w:drawing>
         <wp:inline xmlns:a="http://schemas.openxmlformats.org/drawingml/2006/main" xmlns:pic="http://schemas.openxmlformats.org/drawingml/2006/picture">
           <wp:extent cx="2103120" cy="486271"/>
-          <wp:docPr id="1" name="Picture 1"/>
+          <wp:docPr id="1" name="Picture 1" descr="Luwah Technologies LLC logo" title="Luwah Technologies LLC logo"/>
           <wp:cNvGraphicFramePr>
             <a:graphicFrameLocks noChangeAspect="1"/>
           </wp:cNvGraphicFramePr>

</xml_diff>

<commit_message>
312: act on the adversarial review of the cover and Word safeguards
Cover: the row height is "atLeast", so the closing tagline paints on
every cover instead of being clipped on the two longer ones. Each Doc
sets cover_tag, so the contractor agreement no longer calls itself a
client agreement and the tag fits one line.

Word: an fcntl lock in Word's container is held for the whole export
run, staging goes through a per-run subdirectory, and no DOCX is written
until the lock is held, so a refused run cannot leave a new DOCX beside
an old PDF. The open-document count is now a check inside the lock.

Site: the AI sentence on /agreements and in Terms no longer says client
data "never" goes into AI tools, which the published Doyle Group case
study contradicts. Credentials never; client data only where the signed
agreement provides for it, under terms that do not train on it.
</commit_message>
<xml_diff>
--- a/public/agreements/Contractor_Agreement_LuwahTech_Template_v1.docx
+++ b/public/agreements/Contractor_Agreement_LuwahTech_Template_v1.docx
@@ -13,7 +13,7 @@
       </w:tblGrid>
       <w:tr>
         <w:trPr>
-          <w:trHeight w:val="12527" w:hRule="exact"/>
+          <w:trHeight w:val="12096" w:hRule="atLeast"/>
         </w:trPr>
         <w:tc>
           <w:tcPr>
@@ -45,9 +45,9 @@
                 <w:b w:val="0"/>
                 <w:color w:val="4A90A4"/>
                 <w:sz w:val="18"/>
-                <w:spacing w:val="60"/>
+                <w:spacing w:val="50"/>
               </w:rPr>
-              <w:t>CLIENT AGREEMENT   ·   INDEPENDENT CONTRACTOR AGREEMENT</w:t>
+              <w:t>CONTRACTOR AGREEMENT   ·   SUBCONTRACT TERMS</w:t>
             </w:r>
           </w:p>
           <w:p>
@@ -84,7 +84,7 @@
           </w:p>
           <w:p>
             <w:pPr>
-              <w:spacing w:before="1920" w:after="0"/>
+              <w:spacing w:before="1680" w:after="0"/>
               <w:jc w:val="left"/>
             </w:pPr>
             <w:r>
@@ -132,7 +132,7 @@
           </w:p>
           <w:p>
             <w:pPr>
-              <w:spacing w:before="2200" w:after="40"/>
+              <w:spacing w:before="1680" w:after="40"/>
               <w:jc w:val="left"/>
             </w:pPr>
             <w:r>

</xml_diff>